<commit_message>
motivación y prueba highlight
</commit_message>
<xml_diff>
--- a/_book/Ciencia-Abierta-y-Acceso-Abierto-a-Datos-del-Inecol.docx
+++ b/_book/Ciencia-Abierta-y-Acceso-Abierto-a-Datos-del-Inecol.docx
@@ -3466,7 +3466,7 @@
     </w:p>
     <w:bookmarkEnd w:id="18"/>
     <w:bookmarkEnd w:id="19"/>
-    <w:bookmarkStart w:id="30" w:name="X54f0d23f904e44acc8e311965bb31be46d773ca"/>
+    <w:bookmarkStart w:id="33" w:name="X54f0d23f904e44acc8e311965bb31be46d773ca"/>
     <w:p>
       <w:pPr>
         <w:pStyle w:val="Heading1"/>
@@ -3562,7 +3562,17 @@
         <w:t xml:space="preserve">SECIHTI</w:t>
       </w:r>
       <w:r>
-        <w:t xml:space="preserve">, tiene la responsabilidad de consolidar la infraestructura de datos que alimentará las Agendas Nacionales y los Proyectos Estratégicos de la Secretaría (como la mitigación del cambio climático y la conservación de la biodiversidad). Delegar los datos a Zenodo u otros repositorios dispersa la información y dificulta que la SECIHTI consulte los activos de conocimiento técnico generados por sus propios centros sectorizados.</w:t>
+        <w:t xml:space="preserve">, tiene la responsabilidad de consolidar la infraestructura de datos que alimentará las Agendas Nacionales y los Proyectos Estratégicos de la Secretaría (como la mitigación del cambio climático y la conservación de la biodiversidad). Delegar los datos a Zenodo u otros repositorios dispersa la información y dificulta que la</w:t>
+      </w:r>
+      <w:r>
+        <w:rPr>
+          <w:b/>
+          <w:bCs/>
+        </w:rPr>
+        <w:t xml:space="preserve">SECIHTI</w:t>
+      </w:r>
+      <w:r>
+        <w:t xml:space="preserve">consulte los activos de conocimiento técnico generados por sus propios centros sectorizados.</w:t>
       </w:r>
     </w:p>
     <w:p>
@@ -4378,13 +4388,13 @@
       </w:r>
     </w:p>
     <w:bookmarkEnd w:id="25"/>
-    <w:bookmarkStart w:id="26" w:name="X82169622ff85fa1068202aeda77feb0b6070df7"/>
+    <w:bookmarkStart w:id="27" w:name="X9566383fd1728b90fab201cc0663061e3513878"/>
     <w:p>
       <w:pPr>
         <w:pStyle w:val="Heading3"/>
       </w:pPr>
       <w:r>
-        <w:t xml:space="preserve">1.0.7 Conclusión Estratégica: El Enfoque Híbrido</w:t>
+        <w:t xml:space="preserve">1.0.7 7. Infraestructura Existente y Resultados Tangibles</w:t>
       </w:r>
     </w:p>
     <w:p>
@@ -4392,63 +4402,168 @@
         <w:pStyle w:val="FirstParagraph"/>
       </w:pPr>
       <w:r>
-        <w:t xml:space="preserve">La estrategia óptima para el INECOL no es rechazar a Zenodo u otros repositorios globales, sino adoptar un</w:t>
-      </w:r>
-      <w:r>
-        <w:t xml:space="preserve"> </w:t>
-      </w:r>
-      <w:r>
-        <w:rPr>
-          <w:b/>
-          <w:bCs/>
-        </w:rPr>
-        <w:t xml:space="preserve">enfoque híbrido o federado</w:t>
-      </w:r>
-      <w:r>
-        <w:t xml:space="preserve"> </w:t>
-      </w:r>
-      <w:r>
-        <w:t xml:space="preserve">(Zenodo 2024)</w:t>
-      </w:r>
-      <w:r>
-        <w:t xml:space="preserve">. El Servidor del INECOL debe ser la infraestructura primaria de depósito, donde se garantiza la soberanía legal, la curaduría especializada (FAIR/Darwin Core) y el registro institucional de propiedad intelectual. Posteriormente, mediante protocolos automáticos de interoperabilidad (como OAI-PMH), el repositorio del INECOL puede cosechar o replicar sus metadatos hacia Zenodo y el Repositorio Nacional</w:t>
-      </w:r>
-      <w:r>
-        <w:t xml:space="preserve"> </w:t>
-      </w:r>
-      <w:r>
-        <w:t xml:space="preserve">(</w:t>
-      </w:r>
-      <w:r>
-        <w:t xml:space="preserve">Wilkinson et al.</w:t>
-      </w:r>
-      <w:r>
-        <w:t xml:space="preserve"> </w:t>
-      </w:r>
-      <w:r>
-        <w:t xml:space="preserve">2016)</w:t>
-      </w:r>
-      <w:r>
-        <w:t xml:space="preserve">. Así, el INECOL gana autonomía y control local, mientras multiplica exponencialmente la visibilidad global de sus científicos.</w:t>
-      </w:r>
-    </w:p>
-    <w:bookmarkEnd w:id="26"/>
-    <w:bookmarkStart w:id="29" w:name="peligros-en-el-horizonte"/>
+        <w:t xml:space="preserve">La propuesta de un Servidor de Datos Abiertos para el INECOL no parte de una aspiración teórica o de cero antecedentes institucionales; por el contrario, se sustenta sobre capacidades técnicas instaladas y resultados tangibles de compartición de datos biológicos que ya operan con éxito en el ecosistema nacional.</w:t>
+      </w:r>
+    </w:p>
+    <w:p>
+      <w:pPr>
+        <w:pStyle w:val="BodyText"/>
+      </w:pPr>
+      <w:r>
+        <w:t xml:space="preserve">El primer gran referente es</w:t>
+      </w:r>
+      <w:r>
+        <w:t xml:space="preserve"> </w:t>
+      </w:r>
+      <w:hyperlink r:id="rId26">
+        <w:r>
+          <w:rPr>
+            <w:rStyle w:val="Hyperlink"/>
+            <w:b/>
+            <w:bCs/>
+          </w:rPr>
+          <w:t xml:space="preserve">eFloraMex</w:t>
+        </w:r>
+        <w:r>
+          <w:rPr>
+            <w:rStyle w:val="Hyperlink"/>
+          </w:rPr>
+          <w:t xml:space="preserve"> </w:t>
+        </w:r>
+        <w:r>
+          <w:rPr>
+            <w:rStyle w:val="Hyperlink"/>
+          </w:rPr>
+          <w:t xml:space="preserve">(Flora de México en Línea)</w:t>
+        </w:r>
+      </w:hyperlink>
+      <w:r>
+        <w:t xml:space="preserve">, una plataforma interinstitucional de vanguardia en la que el INECOL parti-cipa activamente junto al Instituto de Biología de la UNAM y otras entidades estratégicas. Este esfuerzo ha permitido la apertura, digitalización y consulta dinámica de tratamientos taxonómicos, mapas de distribución y descripciones morfológicas de la riqueza botánica del país.</w:t>
+      </w:r>
+    </w:p>
+    <w:p>
+      <w:pPr>
+        <w:pStyle w:val="BodyText"/>
+      </w:pPr>
+      <w:r>
+        <w:t xml:space="preserve">El segundo pilar de resultados previos es el Portal de Colecciones Biológicas del INECOL, un esfuerzo institucional que centraliza y expone públicamente los acervos del Herbario XAL, la Colección Entomológica (IEXA) y la Colección de Macrohongos, entre otras. Estas iniciativas ya actúan como servicios de datos abiertos funcionales, resolviendo miles de consultas de investigadores, tomadores de decisiones y la sociedad civil a nivel global.</w:t>
+      </w:r>
+    </w:p>
+    <w:p>
+      <w:pPr>
+        <w:pStyle w:val="BodyText"/>
+      </w:pPr>
+      <w:r>
+        <w:t xml:space="preserve">Sin embargo, estos valiosos portales operan todavía de manera fragmentada o como silos de información especializados en taxonomía y colecciones botánico-entomológicas. La creación del Servidor de Datos Abiertos del INECOL no busca duplicar ni sustituir a</w:t>
+      </w:r>
+      <w:r>
+        <w:t xml:space="preserve"> </w:t>
+      </w:r>
+      <w:r>
+        <w:rPr>
+          <w:b/>
+          <w:bCs/>
+        </w:rPr>
+        <w:t xml:space="preserve">eFloraMex</w:t>
+      </w:r>
+      <w:r>
+        <w:t xml:space="preserve"> </w:t>
+      </w:r>
+      <w:r>
+        <w:t xml:space="preserve">o al Portal de Colecciones; su objetivo es escalar, federar y dotar de gobernanza jurídica y semántica unificada a toda la producción científica del Instituto.</w:t>
+      </w:r>
+    </w:p>
+    <w:p>
+      <w:pPr>
+        <w:pStyle w:val="BodyText"/>
+      </w:pPr>
+      <w:r>
+        <w:t xml:space="preserve">El nuevo repositorio actuará como la infraestructura base que: 1) Amplíe el Espectro del Dato: Integrará no solo registros bióticos de colecciones, sino también datos crudos experimentales, bases de datos geoespaciales (bajo la NOM del INEGI e ISO 19115), secuencias genómicas, scripts de código y modelos de cambio climático que hoy carecen de un portal de salida pública institucional. 2) Garantice la Preservación e Inmutabilidad: Proveerá DOIs institucionales centralizados que blindarán la trazabilidad y la propiedad intelectual de los investigadores del INECOL en redes globales de Ciencia Abierta. 3) Optimice la Interoperabilidad Automática: Permitirá que los datos de colecciones existentes dialoguen automáticamente (v.gr., mediante protocolos OAI-PMH) con el Repositorio Nacional de la</w:t>
+      </w:r>
+      <w:r>
+        <w:rPr>
+          <w:b/>
+          <w:bCs/>
+        </w:rPr>
+        <w:t xml:space="preserve">SECIHTI</w:t>
+      </w:r>
+      <w:r>
+        <w:t xml:space="preserve">y el GBIF, consolidando los éxitos previos del Instituto en una sola política institucional de datos FAIR.</w:t>
+      </w:r>
+    </w:p>
+    <w:bookmarkEnd w:id="27"/>
+    <w:bookmarkStart w:id="28" w:name="X4da3fcb4ace6512eb64dd4b79298b9fe4d5bee8"/>
     <w:p>
       <w:pPr>
         <w:pStyle w:val="Heading3"/>
       </w:pPr>
       <w:r>
-        <w:t xml:space="preserve">1.0.8 Peligros en el horizonte</w:t>
-      </w:r>
-    </w:p>
-    <w:bookmarkStart w:id="27" w:name="X09cfa72c455bfa25c7108e740a1cc2d0540bf43"/>
+        <w:t xml:space="preserve">1.0.8 8. Sinergia Genómica Global: El Modelo GenBank /</w:t>
+      </w:r>
+      <w:r>
+        <w:t xml:space="preserve"> </w:t>
+      </w:r>
+      <w:r>
+        <w:rPr>
+          <w:b/>
+          <w:bCs/>
+        </w:rPr>
+        <w:t xml:space="preserve">INSDC</w:t>
+      </w:r>
+    </w:p>
+    <w:p>
+      <w:pPr>
+        <w:pStyle w:val="FirstParagraph"/>
+      </w:pPr>
+      <w:r>
+        <w:t xml:space="preserve">Un sector importante de la comunidad científica del INECOL especializado en ecología molecular, genómica, sistemática y evolución ya participa activamente en infraestructuras globales maduras mediante el depósito obligatorio de secuencias de nucleótidos en GenBank (NCBI) y sistemas federados similares bajo el consorcio</w:t>
+      </w:r>
+      <w:r>
+        <w:t xml:space="preserve"> </w:t>
+      </w:r>
+      <w:r>
+        <w:rPr>
+          <w:b/>
+          <w:bCs/>
+        </w:rPr>
+        <w:t xml:space="preserve">INSDC</w:t>
+      </w:r>
+      <w:r>
+        <w:t xml:space="preserve"> </w:t>
+      </w:r>
+      <w:r>
+        <w:t xml:space="preserve">(International Nucleotide Sequence Database Collaboration).</w:t>
+      </w:r>
+      <w:r>
+        <w:t xml:space="preserve"> </w:t>
+      </w:r>
+      <w:r>
+        <w:t xml:space="preserve">Lejos de representar una duplicidad de esfuerzos o una carga administrativa adicional para el personal investigador, la arquitectura del Servidor de Datos Abiertos del INECOL está diseñada para operar bajo una lógica de acción sinérgica y complementariedad tecnológica.</w:t>
+      </w:r>
+      <w:r>
+        <w:t xml:space="preserve"> </w:t>
+      </w:r>
+      <w:r>
+        <w:t xml:space="preserve">Bajo este modelo sinérgico, la política institucional establece que: 1. Validación del Flujo de Trabajo Existente: El INECOL reconoce a GenBank como la infraestructura primaria idónea para el alojamiento de datos genómicos crudos y ensamblajes moleculares debido a su nivel de especialización ultra-esencial. 2. Cosecha de Identificadores y Enlace Institucional: El repositorio del INECOL funcionará como un agregador institucional. En lugar de exigir la resubida física de archivos FASTQ o FASTA masivos al servidor local, el investigador registrará en el Servidor del INECOL el número de accesión (Accession Number) o el DOI provisto por GenBank, acompañado de los metadatos contextuales del proyecto, la muestra biológica y la financiación de la SECIHTI. 3. Capitalización del Patrimonio Científico: Este mecanismo permite al Instituto indexar de forma automática la producción genómica de sus laboratorios, visibilizar el impacto de sus secuenciadores en los catálogos públicos auditables y asegurar que el dato genómico permanezca enlazado a la ficha institucional del investigador, cerrando la brecha de dispersión del mérito académico que ocurre cuando los datos se quedan aislados en servidores extranjeros.</w:t>
+      </w:r>
+    </w:p>
+    <w:bookmarkEnd w:id="28"/>
+    <w:bookmarkStart w:id="31" w:name="peligros-en-el-horizonte"/>
+    <w:p>
+      <w:pPr>
+        <w:pStyle w:val="Heading3"/>
+      </w:pPr>
+      <w:r>
+        <w:t xml:space="preserve">1.0.9 9. Peligros en el horizonte</w:t>
+      </w:r>
+    </w:p>
+    <w:bookmarkStart w:id="29" w:name="X0f4e37578414bd26896a6af852ce96df549c66e"/>
     <w:p>
       <w:pPr>
         <w:pStyle w:val="Heading4"/>
       </w:pPr>
       <w:r>
-        <w:t xml:space="preserve">1.0.8.1 El Fenómeno Depredador en la Ciencia Abierta: Del Texto al Dato Abierto</w:t>
+        <w:t xml:space="preserve">1.0.9.1 El Fenómeno Depredador: Del Texto al Dato Abierto</w:t>
       </w:r>
     </w:p>
     <w:p>
@@ -4535,14 +4650,14 @@
         <w:t xml:space="preserve">).</w:t>
       </w:r>
     </w:p>
-    <w:bookmarkEnd w:id="27"/>
-    <w:bookmarkStart w:id="28" w:name="X6826f917001786b06be53719d42dc6476bb0d84"/>
+    <w:bookmarkEnd w:id="29"/>
+    <w:bookmarkStart w:id="30" w:name="X6826f917001786b06be53719d42dc6476bb0d84"/>
     <w:p>
       <w:pPr>
         <w:pStyle w:val="Heading4"/>
       </w:pPr>
       <w:r>
-        <w:t xml:space="preserve">1.0.8.2 Riesgos de la Delegación en Infraestructuras Sin Gobernanza</w:t>
+        <w:t xml:space="preserve">1.0.9.2 Riesgos de la Delegación en Infraestructuras Sin Gobernanza</w:t>
       </w:r>
     </w:p>
     <w:p>
@@ -4670,10 +4785,65 @@
         <w:t xml:space="preserve">La puesta en marcha del Servidor de Datos Abiertos del INECOL neutraliza estos riesgos de raíz, al ofrecer una infraestructura pública blindada presupuestalmente, con curaduría especializada nativa y con la garantía de inmutabilidad institucional exigida por el Estado mexicano.</w:t>
       </w:r>
     </w:p>
-    <w:bookmarkEnd w:id="28"/>
-    <w:bookmarkEnd w:id="29"/>
     <w:bookmarkEnd w:id="30"/>
-    <w:bookmarkStart w:id="33" w:name="cambio-de-conahcyt-a-secihti"/>
+    <w:bookmarkEnd w:id="31"/>
+    <w:bookmarkStart w:id="32" w:name="X82169622ff85fa1068202aeda77feb0b6070df7"/>
+    <w:p>
+      <w:pPr>
+        <w:pStyle w:val="Heading3"/>
+      </w:pPr>
+      <w:r>
+        <w:t xml:space="preserve">1.0.10 Conclusión Estratégica: El Enfoque Híbrido</w:t>
+      </w:r>
+    </w:p>
+    <w:p>
+      <w:pPr>
+        <w:pStyle w:val="FirstParagraph"/>
+      </w:pPr>
+      <w:r>
+        <w:t xml:space="preserve">La estrategia óptima para el INECOL no es rechazar a Zenodo u otros repositorios globales, sino adoptar un</w:t>
+      </w:r>
+      <w:r>
+        <w:t xml:space="preserve"> </w:t>
+      </w:r>
+      <w:r>
+        <w:rPr>
+          <w:b/>
+          <w:bCs/>
+        </w:rPr>
+        <w:t xml:space="preserve">enfoque híbrido o federado</w:t>
+      </w:r>
+      <w:r>
+        <w:t xml:space="preserve"> </w:t>
+      </w:r>
+      <w:r>
+        <w:t xml:space="preserve">(Zenodo 2024)</w:t>
+      </w:r>
+      <w:r>
+        <w:t xml:space="preserve">. El Servidor del INECOL debe ser la infraestructura primaria de depósito, donde se garantiza la soberanía legal, la curaduría especializada (FAIR/Darwin Core) y el registro institucional de propiedad intelectual. Posteriormente, mediante protocolos automáticos de interoperabilidad (como OAI-PMH), el repositorio del INECOL puede cosechar o replicar sus metadatos hacia Zenodo y el Repositorio Nacional</w:t>
+      </w:r>
+      <w:r>
+        <w:t xml:space="preserve"> </w:t>
+      </w:r>
+      <w:r>
+        <w:t xml:space="preserve">(</w:t>
+      </w:r>
+      <w:r>
+        <w:t xml:space="preserve">Wilkinson et al.</w:t>
+      </w:r>
+      <w:r>
+        <w:t xml:space="preserve"> </w:t>
+      </w:r>
+      <w:r>
+        <w:t xml:space="preserve">2016)</w:t>
+      </w:r>
+      <w:r>
+        <w:t xml:space="preserve">. Así, el INECOL gana autonomía y control local, mientras multiplica exponencialmente la visibilidad global de su comunidad científica.</w:t>
+      </w:r>
+    </w:p>
+    <w:bookmarkEnd w:id="32"/>
+    <w:bookmarkEnd w:id="33"/>
+    <w:bookmarkStart w:id="36" w:name="cambio-de-conahcyt-a-secihti"/>
     <w:p>
       <w:pPr>
         <w:pStyle w:val="Heading1"/>
@@ -4714,7 +4884,7 @@
         <w:t xml:space="preserve">A continuación, se hacen algunos señalamientos específicos de ajuste normativo, la actualización del glosario y se ofrecen argumentos que resultan más apropiados para justificar el Repositorio ante el nuevo ecosistema de la SECIHTI.</w:t>
       </w:r>
     </w:p>
-    <w:bookmarkStart w:id="31" w:name="X39e3a0563555eae314686bd853b8310055594ac"/>
+    <w:bookmarkStart w:id="34" w:name="X39e3a0563555eae314686bd853b8310055594ac"/>
     <w:p>
       <w:pPr>
         <w:pStyle w:val="Heading3"/>
@@ -4812,8 +4982,8 @@
         <w:t xml:space="preserve">, que acopia, preserva y garantiza el acceso abierto a la producción científica, tecnológica, humanística y de innovación del país, con la cual interoperará federadamente el Servidor de Datos Abiertos del INECOL.</w:t>
       </w:r>
     </w:p>
-    <w:bookmarkEnd w:id="31"/>
-    <w:bookmarkStart w:id="32" w:name="Xba4d79491cbbb18e319061a96d7b4b175a84ee8"/>
+    <w:bookmarkEnd w:id="34"/>
+    <w:bookmarkStart w:id="35" w:name="Xba4d79491cbbb18e319061a96d7b4b175a84ee8"/>
     <w:p>
       <w:pPr>
         <w:pStyle w:val="Heading3"/>
@@ -4964,9 +5134,9 @@
         <w:t xml:space="preserve">, en lugar de mencionar lineamientos emitidos por el extinto Consejo.</w:t>
       </w:r>
     </w:p>
-    <w:bookmarkEnd w:id="32"/>
-    <w:bookmarkEnd w:id="33"/>
-    <w:bookmarkStart w:id="54" w:name="zenodo-como-ejemplo"/>
+    <w:bookmarkEnd w:id="35"/>
+    <w:bookmarkEnd w:id="36"/>
+    <w:bookmarkStart w:id="57" w:name="zenodo-como-ejemplo"/>
     <w:p>
       <w:pPr>
         <w:pStyle w:val="Heading1"/>
@@ -5033,7 +5203,7 @@
         <w:t xml:space="preserve">A continuación, se presenta un desglose estructurado de los criterios y lineamientos clave derivados de ambas fuentes:</w:t>
       </w:r>
     </w:p>
-    <w:bookmarkStart w:id="34" w:name="X38bc9895e841af86c922d3108004ba5bf0959df"/>
+    <w:bookmarkStart w:id="37" w:name="X38bc9895e841af86c922d3108004ba5bf0959df"/>
     <w:p>
       <w:pPr>
         <w:pStyle w:val="Heading3"/>
@@ -5190,8 +5360,8 @@
         <w:t xml:space="preserve">(con un máximo aproximado de 100 archivos). Cuotas mayores se pueden solicitar y evaluar caso por caso.</w:t>
       </w:r>
     </w:p>
-    <w:bookmarkEnd w:id="34"/>
-    <w:bookmarkStart w:id="35" w:name="Xfa8e2c8b7a0f9dfeb5c9386d331f22853c3453e"/>
+    <w:bookmarkEnd w:id="37"/>
+    <w:bookmarkStart w:id="38" w:name="Xfa8e2c8b7a0f9dfeb5c9386d331f22853c3453e"/>
     <w:p>
       <w:pPr>
         <w:pStyle w:val="Heading3"/>
@@ -5321,8 +5491,8 @@
         <w:t xml:space="preserve">, lo que facilita que motores de búsqueda externos los indexen.</w:t>
       </w:r>
     </w:p>
-    <w:bookmarkEnd w:id="35"/>
-    <w:bookmarkStart w:id="36" w:name="X7623938980cfe5cfebf525c12cdf262807bd78a"/>
+    <w:bookmarkEnd w:id="38"/>
+    <w:bookmarkStart w:id="39" w:name="X7623938980cfe5cfebf525c12cdf262807bd78a"/>
     <w:p>
       <w:pPr>
         <w:pStyle w:val="Heading3"/>
@@ -5404,8 +5574,8 @@
         <w:t xml:space="preserve">El CERN goza de un estatus legal particular como organización internacional. Sin embargo, para efectos operativos de Zenodo, sus infraestructuras cumplen rigurosamente con altos estándares de protección de datos alineados con el espíritu del GDPR (Reglamento General de Protección de Datos de la UE).</w:t>
       </w:r>
     </w:p>
-    <w:bookmarkEnd w:id="36"/>
-    <w:bookmarkStart w:id="37" w:name="niveles-de-acceso-y-modificaciones"/>
+    <w:bookmarkEnd w:id="39"/>
+    <w:bookmarkStart w:id="40" w:name="niveles-de-acceso-y-modificaciones"/>
     <w:p>
       <w:pPr>
         <w:pStyle w:val="Heading3"/>
@@ -5576,8 +5746,8 @@
         <w:t xml:space="preserve">, la cual recibirá un Identificador de Objeto Digital (DOI) diferente. Esto asegura la trazabilidad científica.</w:t>
       </w:r>
     </w:p>
-    <w:bookmarkEnd w:id="37"/>
-    <w:bookmarkStart w:id="38" w:name="X72cb5341b4578a3c9b8f92aca5bb9095bfca49b"/>
+    <w:bookmarkEnd w:id="40"/>
+    <w:bookmarkStart w:id="41" w:name="X72cb5341b4578a3c9b8f92aca5bb9095bfca49b"/>
     <w:p>
       <w:pPr>
         <w:pStyle w:val="Heading3"/>
@@ -5743,8 +5913,8 @@
         <w:t xml:space="preserve">indicando que el registro existió y el motivo de su remoción, para no romper la integridad de las citas académicas.</w:t>
       </w:r>
     </w:p>
-    <w:bookmarkEnd w:id="38"/>
-    <w:bookmarkStart w:id="39" w:name="resumen-de-la-perspectiva"/>
+    <w:bookmarkEnd w:id="41"/>
+    <w:bookmarkStart w:id="42" w:name="resumen-de-la-perspectiva"/>
     <w:p>
       <w:pPr>
         <w:pStyle w:val="Heading3"/>
@@ -5832,8 +6002,8 @@
         <w:t xml:space="preserve">.</w:t>
       </w:r>
     </w:p>
-    <w:bookmarkEnd w:id="39"/>
-    <w:bookmarkStart w:id="53" w:name="X449ed843dca3d710b52a002e436b372f618f80a"/>
+    <w:bookmarkEnd w:id="42"/>
+    <w:bookmarkStart w:id="56" w:name="X449ed843dca3d710b52a002e436b372f618f80a"/>
     <w:p>
       <w:pPr>
         <w:pStyle w:val="Heading2"/>
@@ -5850,7 +6020,7 @@
         <w:t xml:space="preserve">Este documento reúne las referencias oficiales, políticas públicas y circulares operacionales que norman y respaldan la infraestructura del servicio de hospedaje de datos abiertos de Zenodo, así como el marco regulatorio del CERN como su entidad proveedora de infraestructura masiva.</w:t>
       </w:r>
     </w:p>
-    <w:bookmarkStart w:id="44" w:name="Xcb906d6e330e04db78d4e8b5561744b23752659"/>
+    <w:bookmarkStart w:id="47" w:name="Xcb906d6e330e04db78d4e8b5561744b23752659"/>
     <w:p>
       <w:pPr>
         <w:pStyle w:val="Heading3"/>
@@ -5859,7 +6029,7 @@
         <w:t xml:space="preserve">3.1.1 1. Documentos Principales de Política y Gobernanza</w:t>
       </w:r>
     </w:p>
-    <w:bookmarkStart w:id="41" w:name="X90e22729b06a9cff907c9b257486cf978898c3a"/>
+    <w:bookmarkStart w:id="44" w:name="X90e22729b06a9cff907c9b257486cf978898c3a"/>
     <w:p>
       <w:pPr>
         <w:pStyle w:val="Heading4"/>
@@ -5962,7 +6132,7 @@
       <w:r>
         <w:t xml:space="preserve"> </w:t>
       </w:r>
-      <w:hyperlink r:id="rId40">
+      <w:hyperlink r:id="rId43">
         <w:r>
           <w:rPr>
             <w:rStyle w:val="Hyperlink"/>
@@ -5971,8 +6141,8 @@
         </w:r>
       </w:hyperlink>
     </w:p>
-    <w:bookmarkEnd w:id="41"/>
-    <w:bookmarkStart w:id="43" w:name="X4f162501dc14a3988dcc7871e13cc20f9aec268"/>
+    <w:bookmarkEnd w:id="44"/>
+    <w:bookmarkStart w:id="46" w:name="X4f162501dc14a3988dcc7871e13cc20f9aec268"/>
     <w:p>
       <w:pPr>
         <w:pStyle w:val="Heading4"/>
@@ -6065,7 +6235,7 @@
       <w:r>
         <w:t xml:space="preserve"> </w:t>
       </w:r>
-      <w:hyperlink r:id="rId42">
+      <w:hyperlink r:id="rId45">
         <w:r>
           <w:rPr>
             <w:rStyle w:val="Hyperlink"/>
@@ -6074,9 +6244,9 @@
         </w:r>
       </w:hyperlink>
     </w:p>
-    <w:bookmarkEnd w:id="43"/>
-    <w:bookmarkEnd w:id="44"/>
-    <w:bookmarkStart w:id="49" w:name="X310d5ae13e9b57819c0eeae54025fdcba2b8dde"/>
+    <w:bookmarkEnd w:id="46"/>
+    <w:bookmarkEnd w:id="47"/>
+    <w:bookmarkStart w:id="52" w:name="X310d5ae13e9b57819c0eeae54025fdcba2b8dde"/>
     <w:p>
       <w:pPr>
         <w:pStyle w:val="Heading3"/>
@@ -6085,7 +6255,7 @@
         <w:t xml:space="preserve">3.1.2 2. Términos de Servicio y Privacidad (Soporte Técnico-Legal)</w:t>
       </w:r>
     </w:p>
-    <w:bookmarkStart w:id="46" w:name="X513cc11dfdf87eb80b2859a88a0518c526a45f9"/>
+    <w:bookmarkStart w:id="49" w:name="X513cc11dfdf87eb80b2859a88a0518c526a45f9"/>
     <w:p>
       <w:pPr>
         <w:pStyle w:val="Heading4"/>
@@ -6178,7 +6348,7 @@
       <w:r>
         <w:t xml:space="preserve"> </w:t>
       </w:r>
-      <w:hyperlink r:id="rId45">
+      <w:hyperlink r:id="rId48">
         <w:r>
           <w:rPr>
             <w:rStyle w:val="Hyperlink"/>
@@ -6187,8 +6357,8 @@
         </w:r>
       </w:hyperlink>
     </w:p>
-    <w:bookmarkEnd w:id="46"/>
-    <w:bookmarkStart w:id="48" w:name="X3984e5fdca23071096195afb4c53d62c06cd849"/>
+    <w:bookmarkEnd w:id="49"/>
+    <w:bookmarkStart w:id="51" w:name="X3984e5fdca23071096195afb4c53d62c06cd849"/>
     <w:p>
       <w:pPr>
         <w:pStyle w:val="Heading4"/>
@@ -6281,7 +6451,7 @@
       <w:r>
         <w:t xml:space="preserve"> </w:t>
       </w:r>
-      <w:hyperlink r:id="rId47">
+      <w:hyperlink r:id="rId50">
         <w:r>
           <w:rPr>
             <w:rStyle w:val="Hyperlink"/>
@@ -6290,9 +6460,9 @@
         </w:r>
       </w:hyperlink>
     </w:p>
-    <w:bookmarkEnd w:id="48"/>
-    <w:bookmarkEnd w:id="49"/>
-    <w:bookmarkStart w:id="52" w:name="arquitectura-de-datos-y-preservación"/>
+    <w:bookmarkEnd w:id="51"/>
+    <w:bookmarkEnd w:id="52"/>
+    <w:bookmarkStart w:id="55" w:name="arquitectura-de-datos-y-preservación"/>
     <w:p>
       <w:pPr>
         <w:pStyle w:val="Heading3"/>
@@ -6301,7 +6471,7 @@
         <w:t xml:space="preserve">3.1.3 3. Arquitectura de Datos y Preservación</w:t>
       </w:r>
     </w:p>
-    <w:bookmarkStart w:id="51" w:name="X2167fbb3a4db5a35156a5ab1f287fc81650a9c9"/>
+    <w:bookmarkStart w:id="54" w:name="X2167fbb3a4db5a35156a5ab1f287fc81650a9c9"/>
     <w:p>
       <w:pPr>
         <w:pStyle w:val="Heading4"/>
@@ -6436,7 +6606,7 @@
       <w:r>
         <w:t xml:space="preserve"> </w:t>
       </w:r>
-      <w:hyperlink r:id="rId50">
+      <w:hyperlink r:id="rId53">
         <w:r>
           <w:rPr>
             <w:rStyle w:val="Hyperlink"/>
@@ -6489,11 +6659,11 @@
         <w:t xml:space="preserve">, lo que faculta a los agregadores globales de ciencia abierta a indexar y enlazar permanentemente estos documentos sin restricciones comerciales.</w:t>
       </w:r>
     </w:p>
-    <w:bookmarkEnd w:id="51"/>
-    <w:bookmarkEnd w:id="52"/>
-    <w:bookmarkEnd w:id="53"/>
     <w:bookmarkEnd w:id="54"/>
-    <w:bookmarkStart w:id="61" w:name="lecciones-aprendidad-de-zenodo"/>
+    <w:bookmarkEnd w:id="55"/>
+    <w:bookmarkEnd w:id="56"/>
+    <w:bookmarkEnd w:id="57"/>
+    <w:bookmarkStart w:id="64" w:name="lecciones-aprendidad-de-zenodo"/>
     <w:p>
       <w:pPr>
         <w:pStyle w:val="Heading1"/>
@@ -6560,7 +6730,7 @@
         <w:t xml:space="preserve">A continuación, se presenta un análisis detallado para enriquecer la propuesta del Inecol. Lo que se argumenta a continuación deriva de lo que ya ha resuelto Zenodo. La reflexión busca identificar cómo puede adaptarse con éxito al ecosistema de los Centros Públicos de Investigación (CPI) en México.</w:t>
       </w:r>
     </w:p>
-    <w:bookmarkStart w:id="55" w:name="Xa6a8ff8539510f36c4fa646195cacaa258faeb1"/>
+    <w:bookmarkStart w:id="58" w:name="Xa6a8ff8539510f36c4fa646195cacaa258faeb1"/>
     <w:p>
       <w:pPr>
         <w:pStyle w:val="Heading3"/>
@@ -6740,8 +6910,8 @@
         <w:t xml:space="preserve">oficial, protegiendo la prelación intelectual del investigador del INECOL.</w:t>
       </w:r>
     </w:p>
-    <w:bookmarkEnd w:id="55"/>
-    <w:bookmarkStart w:id="56" w:name="X9e58660a33098b057eb289fe2e9431833795a6d"/>
+    <w:bookmarkEnd w:id="58"/>
+    <w:bookmarkStart w:id="59" w:name="X9e58660a33098b057eb289fe2e9431833795a6d"/>
     <w:p>
       <w:pPr>
         <w:pStyle w:val="Heading3"/>
@@ -6978,8 +7148,8 @@
         <w:t xml:space="preserve">legal obligatorio). El investigador debe firmar bajo protesta de decir verdad que sus datos no violan confidencialidad ni contienen datos personales desanonimizados. El Curador de Datos debe tener un rol meramente operativo, protegiendo al Instituto de responsabilidades por omisiones del personal.</w:t>
       </w:r>
     </w:p>
-    <w:bookmarkEnd w:id="56"/>
-    <w:bookmarkStart w:id="57" w:name="Xb6b9af8cd6ff7779318196b98522c429f6b3dfe"/>
+    <w:bookmarkEnd w:id="59"/>
+    <w:bookmarkStart w:id="60" w:name="Xb6b9af8cd6ff7779318196b98522c429f6b3dfe"/>
     <w:p>
       <w:pPr>
         <w:pStyle w:val="Heading3"/>
@@ -7138,8 +7308,8 @@
         <w:t xml:space="preserve">. Esto genera visibilidad y citas para el investigador incluso antes de liberar los datos de manera abierta.</w:t>
       </w:r>
     </w:p>
-    <w:bookmarkEnd w:id="57"/>
-    <w:bookmarkStart w:id="58" w:name="X759b13b4a7d9a58cd20c23a6a4871ef2023ce26"/>
+    <w:bookmarkEnd w:id="60"/>
+    <w:bookmarkStart w:id="61" w:name="X759b13b4a7d9a58cd20c23a6a4871ef2023ce26"/>
     <w:p>
       <w:pPr>
         <w:pStyle w:val="Heading3"/>
@@ -7303,8 +7473,8 @@
         <w:t xml:space="preserve">, debe activarse mediante espejos federados de almacenamiento para garantizar la persistencia del patrimonio científico.</w:t>
       </w:r>
     </w:p>
-    <w:bookmarkEnd w:id="58"/>
-    <w:bookmarkStart w:id="60" w:name="Xdc44c27b2e5685044753f9c3927c7b893e0f0c6"/>
+    <w:bookmarkEnd w:id="61"/>
+    <w:bookmarkStart w:id="63" w:name="Xdc44c27b2e5685044753f9c3927c7b893e0f0c6"/>
     <w:p>
       <w:pPr>
         <w:pStyle w:val="Heading2"/>
@@ -7373,7 +7543,7 @@
         <w:t xml:space="preserve">Sugiere al Comité que el depósito de datos abiertos (con sus DOIs correspondientes) sea considerado explícitamente como un indicador de productividad positiva dentro de los criterios de evaluación interna del personal investigador y técnico del INECOL.</w:t>
       </w:r>
     </w:p>
-    <w:bookmarkStart w:id="59" w:name="X8e267c338efdbe71f92923fe4a7670fda865a75"/>
+    <w:bookmarkStart w:id="62" w:name="X8e267c338efdbe71f92923fe4a7670fda865a75"/>
     <w:p>
       <w:pPr>
         <w:pStyle w:val="Heading3"/>
@@ -7436,10 +7606,10 @@
         <w:t xml:space="preserve">El proceso de Ingesta requerirá que la persona Depositaria acepte explícitamente los Términos de Uso del Servidor, mediante los cuales declara, bajo protesta de decir verdad, que posee los derechos, consentimientos o autorizaciones necesarias para la difusión de los datos, deslindando al Instituto de Ecología, A.C., de cualquier reclamación por violaciones a derechos de propiedad intelectual, confidencialidad o normativas de protección de datos personales. La Curaduría de Datos se limitará estrictamente a la verificación técnica de formatos y metadatos, sin que ello convalide legalmente el fondo del contenido depositado.</w:t>
       </w:r>
     </w:p>
-    <w:bookmarkEnd w:id="59"/>
-    <w:bookmarkEnd w:id="60"/>
-    <w:bookmarkEnd w:id="61"/>
-    <w:bookmarkStart w:id="65" w:name="Xc2f61c3795a40a48121e131054998b241904a0c"/>
+    <w:bookmarkEnd w:id="62"/>
+    <w:bookmarkEnd w:id="63"/>
+    <w:bookmarkEnd w:id="64"/>
+    <w:bookmarkStart w:id="68" w:name="Xc2f61c3795a40a48121e131054998b241904a0c"/>
     <w:p>
       <w:pPr>
         <w:pStyle w:val="Heading1"/>
@@ -7458,7 +7628,7 @@
         <w:t xml:space="preserve">)</w:t>
       </w:r>
     </w:p>
-    <w:bookmarkStart w:id="63" w:name="X8a93c840a2af8e9e3adc91e42f49f5217ba3dba"/>
+    <w:bookmarkStart w:id="66" w:name="X8a93c840a2af8e9e3adc91e42f49f5217ba3dba"/>
     <w:p>
       <w:pPr>
         <w:pStyle w:val="Heading3"/>
@@ -7696,7 +7866,7 @@
         <w:t xml:space="preserve">.</w:t>
       </w:r>
     </w:p>
-    <w:bookmarkStart w:id="62" w:name="Xb5d00a5f3d726f6a7d8a3f6d5d595aeaf953455"/>
+    <w:bookmarkStart w:id="65" w:name="Xb5d00a5f3d726f6a7d8a3f6d5d595aeaf953455"/>
     <w:p>
       <w:pPr>
         <w:pStyle w:val="Heading5"/>
@@ -7864,9 +8034,9 @@
         <w:t xml:space="preserve">.</w:t>
       </w:r>
     </w:p>
-    <w:bookmarkEnd w:id="62"/>
-    <w:bookmarkEnd w:id="63"/>
-    <w:bookmarkStart w:id="64" w:name="X6ffc653eb435ac1ed8481dd44f01a9004658731"/>
+    <w:bookmarkEnd w:id="65"/>
+    <w:bookmarkEnd w:id="66"/>
+    <w:bookmarkStart w:id="67" w:name="X6ffc653eb435ac1ed8481dd44f01a9004658731"/>
     <w:p>
       <w:pPr>
         <w:pStyle w:val="Heading3"/>
@@ -8120,9 +8290,9 @@
         <w:t xml:space="preserve">.</w:t>
       </w:r>
     </w:p>
-    <w:bookmarkEnd w:id="64"/>
-    <w:bookmarkEnd w:id="65"/>
-    <w:bookmarkStart w:id="71" w:name="principios-fair"/>
+    <w:bookmarkEnd w:id="67"/>
+    <w:bookmarkEnd w:id="68"/>
+    <w:bookmarkStart w:id="74" w:name="principios-fair"/>
     <w:p>
       <w:pPr>
         <w:pStyle w:val="Heading1"/>
@@ -8131,7 +8301,7 @@
         <w:t xml:space="preserve">6. Principios FAIR</w:t>
       </w:r>
     </w:p>
-    <w:bookmarkStart w:id="66" w:name="los-principios-fair-como-infraestructura"/>
+    <w:bookmarkStart w:id="69" w:name="los-principios-fair-como-infraestructura"/>
     <w:p>
       <w:pPr>
         <w:pStyle w:val="Heading3"/>
@@ -8382,8 +8552,8 @@
         <w:t xml:space="preserve">, es necesario modificar o adicionar artículos específicos en los capítulos clave en la materia.</w:t>
       </w:r>
     </w:p>
-    <w:bookmarkEnd w:id="66"/>
-    <w:bookmarkStart w:id="70" w:name="sugerencias-para-los-lineamientos-inecol"/>
+    <w:bookmarkEnd w:id="69"/>
+    <w:bookmarkStart w:id="73" w:name="sugerencias-para-los-lineamientos-inecol"/>
     <w:p>
       <w:pPr>
         <w:pStyle w:val="Heading3"/>
@@ -8547,7 +8717,7 @@
         <w:t xml:space="preserve">En específico, se sugieren los siguientes elementos que vale la pena considerar.</w:t>
       </w:r>
     </w:p>
-    <w:bookmarkStart w:id="67" w:name="X69ace5540f715b31ebbab0704a2e7e86c833f08"/>
+    <w:bookmarkStart w:id="70" w:name="X69ace5540f715b31ebbab0704a2e7e86c833f08"/>
     <w:p>
       <w:pPr>
         <w:pStyle w:val="Heading4"/>
@@ -8642,8 +8812,8 @@
         <w:t xml:space="preserve">Acto de publicación técnica formal mediante el cual una persona Depositaria incorpora conjuntos de datos primarios o secundarios a una infraestructura institucional provista de un identificador persistente e inmutable, registrando de manera fehaciente la prelación temporal y autoría de su esfuerzo de investigación de forma independiente a la publicación posterior de un manuscrito narrativo.</w:t>
       </w:r>
     </w:p>
-    <w:bookmarkEnd w:id="67"/>
-    <w:bookmarkStart w:id="68" w:name="X414019ba7cbbacc8cf0105242c85ea8c26429b1"/>
+    <w:bookmarkEnd w:id="70"/>
+    <w:bookmarkStart w:id="71" w:name="X414019ba7cbbacc8cf0105242c85ea8c26429b1"/>
     <w:p>
       <w:pPr>
         <w:pStyle w:val="Heading4"/>
@@ -8950,8 +9120,8 @@
         <w:t xml:space="preserve">al conjunto de datos que garantice su inmutabilidad y trazabilidad institucional; […]</w:t>
       </w:r>
     </w:p>
-    <w:bookmarkEnd w:id="68"/>
-    <w:bookmarkStart w:id="69" w:name="X441f9b4ee6a8f44196b69cd0c57fd4dccb11afd"/>
+    <w:bookmarkEnd w:id="71"/>
+    <w:bookmarkStart w:id="72" w:name="X441f9b4ee6a8f44196b69cd0c57fd4dccb11afd"/>
     <w:p>
       <w:pPr>
         <w:pStyle w:val="Heading4"/>
@@ -8986,10 +9156,10 @@
         <w:t xml:space="preserve">Que la evidencia cienciométrica global demuestra que las prácticas conjuntas de Ciencia Abierta—especialmente el depósito de preprints, códigos de análisis y datos primarios dotados de identificadores inmutables en infraestructuras de confianza— generan un efecto sinérgico que incrementa de forma estadísticamente significativa el impacto citacional, protege la prioridad intelectual de los autores y eleva la visibilidad internacional de los Centros Públicos de Investigación;</w:t>
       </w:r>
     </w:p>
-    <w:bookmarkEnd w:id="69"/>
-    <w:bookmarkEnd w:id="70"/>
-    <w:bookmarkEnd w:id="71"/>
-    <w:bookmarkStart w:id="109" w:name="references"/>
+    <w:bookmarkEnd w:id="72"/>
+    <w:bookmarkEnd w:id="73"/>
+    <w:bookmarkEnd w:id="74"/>
+    <w:bookmarkStart w:id="112" w:name="references"/>
     <w:p>
       <w:pPr>
         <w:pStyle w:val="Heading1"/>
@@ -8998,8 +9168,8 @@
         <w:t xml:space="preserve">References</w:t>
       </w:r>
     </w:p>
-    <w:bookmarkStart w:id="108" w:name="refs"/>
-    <w:bookmarkStart w:id="73" w:name="ref-cern_oc11_2001"/>
+    <w:bookmarkStart w:id="111" w:name="refs"/>
+    <w:bookmarkStart w:id="76" w:name="ref-cern_oc11_2001"/>
     <w:p>
       <w:pPr>
         <w:pStyle w:val="Bibliography"/>
@@ -9023,7 +9193,7 @@
       <w:r>
         <w:t xml:space="preserve"> </w:t>
       </w:r>
-      <w:hyperlink r:id="rId72">
+      <w:hyperlink r:id="rId75">
         <w:r>
           <w:rPr>
             <w:rStyle w:val="Hyperlink"/>
@@ -9035,8 +9205,8 @@
         <w:t xml:space="preserve">.</w:t>
       </w:r>
     </w:p>
-    <w:bookmarkEnd w:id="73"/>
-    <w:bookmarkStart w:id="75" w:name="ref-colavizza_analysis_2024"/>
+    <w:bookmarkEnd w:id="76"/>
+    <w:bookmarkStart w:id="78" w:name="ref-colavizza_analysis_2024"/>
     <w:p>
       <w:pPr>
         <w:pStyle w:val="Bibliography"/>
@@ -9072,7 +9242,7 @@
       <w:r>
         <w:t xml:space="preserve"> </w:t>
       </w:r>
-      <w:hyperlink r:id="rId74">
+      <w:hyperlink r:id="rId77">
         <w:r>
           <w:rPr>
             <w:rStyle w:val="Hyperlink"/>
@@ -9084,8 +9254,8 @@
         <w:t xml:space="preserve">.</w:t>
       </w:r>
     </w:p>
-    <w:bookmarkEnd w:id="75"/>
-    <w:bookmarkStart w:id="77" w:name="ref-colavizza_citation_2020"/>
+    <w:bookmarkEnd w:id="78"/>
+    <w:bookmarkStart w:id="80" w:name="ref-colavizza_citation_2020"/>
     <w:p>
       <w:pPr>
         <w:pStyle w:val="Bibliography"/>
@@ -9121,7 +9291,7 @@
       <w:r>
         <w:t xml:space="preserve"> </w:t>
       </w:r>
-      <w:hyperlink r:id="rId76">
+      <w:hyperlink r:id="rId79">
         <w:r>
           <w:rPr>
             <w:rStyle w:val="Hyperlink"/>
@@ -9133,8 +9303,8 @@
         <w:t xml:space="preserve">.</w:t>
       </w:r>
     </w:p>
-    <w:bookmarkEnd w:id="77"/>
-    <w:bookmarkStart w:id="79" w:name="ref-cousijn_data_2018"/>
+    <w:bookmarkEnd w:id="80"/>
+    <w:bookmarkStart w:id="82" w:name="ref-cousijn_data_2018"/>
     <w:p>
       <w:pPr>
         <w:pStyle w:val="Bibliography"/>
@@ -9170,7 +9340,7 @@
       <w:r>
         <w:t xml:space="preserve"> </w:t>
       </w:r>
-      <w:hyperlink r:id="rId78">
+      <w:hyperlink r:id="rId81">
         <w:r>
           <w:rPr>
             <w:rStyle w:val="Hyperlink"/>
@@ -9182,8 +9352,8 @@
         <w:t xml:space="preserve">.</w:t>
       </w:r>
     </w:p>
-    <w:bookmarkEnd w:id="79"/>
-    <w:bookmarkStart w:id="81" w:name="ref-dona_fair_2022"/>
+    <w:bookmarkEnd w:id="82"/>
+    <w:bookmarkStart w:id="84" w:name="ref-dona_fair_2022"/>
     <w:p>
       <w:pPr>
         <w:pStyle w:val="Bibliography"/>
@@ -9222,7 +9392,7 @@
       <w:r>
         <w:t xml:space="preserve"> </w:t>
       </w:r>
-      <w:hyperlink r:id="rId80">
+      <w:hyperlink r:id="rId83">
         <w:r>
           <w:rPr>
             <w:rStyle w:val="Hyperlink"/>
@@ -9234,8 +9404,8 @@
         <w:t xml:space="preserve">.</w:t>
       </w:r>
     </w:p>
-    <w:bookmarkEnd w:id="81"/>
-    <w:bookmarkStart w:id="83" w:name="ref-gomes_why_2022"/>
+    <w:bookmarkEnd w:id="84"/>
+    <w:bookmarkStart w:id="86" w:name="ref-gomes_why_2022"/>
     <w:p>
       <w:pPr>
         <w:pStyle w:val="Bibliography"/>
@@ -9271,7 +9441,7 @@
       <w:r>
         <w:t xml:space="preserve"> </w:t>
       </w:r>
-      <w:hyperlink r:id="rId82">
+      <w:hyperlink r:id="rId85">
         <w:r>
           <w:rPr>
             <w:rStyle w:val="Hyperlink"/>
@@ -9283,8 +9453,8 @@
         <w:t xml:space="preserve">.</w:t>
       </w:r>
     </w:p>
-    <w:bookmarkEnd w:id="83"/>
-    <w:bookmarkStart w:id="85" w:name="ref-inegi_norma_2024"/>
+    <w:bookmarkEnd w:id="86"/>
+    <w:bookmarkStart w:id="88" w:name="ref-inegi_norma_2024"/>
     <w:p>
       <w:pPr>
         <w:pStyle w:val="Bibliography"/>
@@ -9404,7 +9574,7 @@
       <w:r>
         <w:t xml:space="preserve"> </w:t>
       </w:r>
-      <w:hyperlink r:id="rId84">
+      <w:hyperlink r:id="rId87">
         <w:r>
           <w:rPr>
             <w:rStyle w:val="Hyperlink"/>
@@ -9416,8 +9586,8 @@
         <w:t xml:space="preserve">.</w:t>
       </w:r>
     </w:p>
-    <w:bookmarkEnd w:id="85"/>
-    <w:bookmarkStart w:id="87" w:name="ref-islam_bridging_2024"/>
+    <w:bookmarkEnd w:id="88"/>
+    <w:bookmarkStart w:id="90" w:name="ref-islam_bridging_2024"/>
     <w:p>
       <w:pPr>
         <w:pStyle w:val="Bibliography"/>
@@ -9453,7 +9623,7 @@
       <w:r>
         <w:t xml:space="preserve"> </w:t>
       </w:r>
-      <w:hyperlink r:id="rId86">
+      <w:hyperlink r:id="rId89">
         <w:r>
           <w:rPr>
             <w:rStyle w:val="Hyperlink"/>
@@ -9465,8 +9635,8 @@
         <w:t xml:space="preserve">.</w:t>
       </w:r>
     </w:p>
-    <w:bookmarkEnd w:id="87"/>
-    <w:bookmarkStart w:id="89" w:name="ref-jantzen_putting_2026"/>
+    <w:bookmarkEnd w:id="90"/>
+    <w:bookmarkStart w:id="92" w:name="ref-jantzen_putting_2026"/>
     <w:p>
       <w:pPr>
         <w:pStyle w:val="Bibliography"/>
@@ -9502,7 +9672,7 @@
       <w:r>
         <w:t xml:space="preserve"> </w:t>
       </w:r>
-      <w:hyperlink r:id="rId88">
+      <w:hyperlink r:id="rId91">
         <w:r>
           <w:rPr>
             <w:rStyle w:val="Hyperlink"/>
@@ -9514,8 +9684,8 @@
         <w:t xml:space="preserve">.</w:t>
       </w:r>
     </w:p>
-    <w:bookmarkEnd w:id="89"/>
-    <w:bookmarkStart w:id="91" w:name="ref-kuehna_open_2024"/>
+    <w:bookmarkEnd w:id="92"/>
+    <w:bookmarkStart w:id="94" w:name="ref-kuehna_open_2024"/>
     <w:p>
       <w:pPr>
         <w:pStyle w:val="Bibliography"/>
@@ -9554,7 +9724,7 @@
       <w:r>
         <w:t xml:space="preserve"> </w:t>
       </w:r>
-      <w:hyperlink r:id="rId90">
+      <w:hyperlink r:id="rId93">
         <w:r>
           <w:rPr>
             <w:rStyle w:val="Hyperlink"/>
@@ -9566,8 +9736,8 @@
         <w:t xml:space="preserve">.</w:t>
       </w:r>
     </w:p>
-    <w:bookmarkEnd w:id="91"/>
-    <w:bookmarkStart w:id="93" w:name="ref-morales_open_2025"/>
+    <w:bookmarkEnd w:id="94"/>
+    <w:bookmarkStart w:id="96" w:name="ref-morales_open_2025"/>
     <w:p>
       <w:pPr>
         <w:pStyle w:val="Bibliography"/>
@@ -9603,7 +9773,7 @@
       <w:r>
         <w:t xml:space="preserve"> </w:t>
       </w:r>
-      <w:hyperlink r:id="rId92">
+      <w:hyperlink r:id="rId95">
         <w:r>
           <w:rPr>
             <w:rStyle w:val="Hyperlink"/>
@@ -9615,8 +9785,8 @@
         <w:t xml:space="preserve">.</w:t>
       </w:r>
     </w:p>
-    <w:bookmarkEnd w:id="93"/>
-    <w:bookmarkStart w:id="95" w:name="ref-penev_from_2017"/>
+    <w:bookmarkEnd w:id="96"/>
+    <w:bookmarkStart w:id="98" w:name="ref-penev_from_2017"/>
     <w:p>
       <w:pPr>
         <w:pStyle w:val="Bibliography"/>
@@ -9652,7 +9822,7 @@
       <w:r>
         <w:t xml:space="preserve"> </w:t>
       </w:r>
-      <w:hyperlink r:id="rId94">
+      <w:hyperlink r:id="rId97">
         <w:r>
           <w:rPr>
             <w:rStyle w:val="Hyperlink"/>
@@ -9664,8 +9834,8 @@
         <w:t xml:space="preserve">.</w:t>
       </w:r>
     </w:p>
-    <w:bookmarkEnd w:id="95"/>
-    <w:bookmarkStart w:id="97" w:name="ref-penev_uniting_2024"/>
+    <w:bookmarkEnd w:id="98"/>
+    <w:bookmarkStart w:id="100" w:name="ref-penev_uniting_2024"/>
     <w:p>
       <w:pPr>
         <w:pStyle w:val="Bibliography"/>
@@ -9701,7 +9871,7 @@
       <w:r>
         <w:t xml:space="preserve"> </w:t>
       </w:r>
-      <w:hyperlink r:id="rId96">
+      <w:hyperlink r:id="rId99">
         <w:r>
           <w:rPr>
             <w:rStyle w:val="Hyperlink"/>
@@ -9713,8 +9883,8 @@
         <w:t xml:space="preserve">.</w:t>
       </w:r>
     </w:p>
-    <w:bookmarkEnd w:id="97"/>
-    <w:bookmarkStart w:id="99" w:name="ref-sanchez_biodiversity_2022"/>
+    <w:bookmarkEnd w:id="100"/>
+    <w:bookmarkStart w:id="102" w:name="ref-sanchez_biodiversity_2022"/>
     <w:p>
       <w:pPr>
         <w:pStyle w:val="Bibliography"/>
@@ -9750,7 +9920,7 @@
       <w:r>
         <w:t xml:space="preserve"> </w:t>
       </w:r>
-      <w:hyperlink r:id="rId98">
+      <w:hyperlink r:id="rId101">
         <w:r>
           <w:rPr>
             <w:rStyle w:val="Hyperlink"/>
@@ -9762,8 +9932,8 @@
         <w:t xml:space="preserve">.</w:t>
       </w:r>
     </w:p>
-    <w:bookmarkEnd w:id="99"/>
-    <w:bookmarkStart w:id="101" w:name="ref-thelwall_data_2020"/>
+    <w:bookmarkEnd w:id="102"/>
+    <w:bookmarkStart w:id="104" w:name="ref-thelwall_data_2020"/>
     <w:p>
       <w:pPr>
         <w:pStyle w:val="Bibliography"/>
@@ -9796,7 +9966,7 @@
       <w:r>
         <w:t xml:space="preserve"> </w:t>
       </w:r>
-      <w:hyperlink r:id="rId100">
+      <w:hyperlink r:id="rId103">
         <w:r>
           <w:rPr>
             <w:rStyle w:val="Hyperlink"/>
@@ -9808,8 +9978,8 @@
         <w:t xml:space="preserve">.</w:t>
       </w:r>
     </w:p>
-    <w:bookmarkEnd w:id="101"/>
-    <w:bookmarkStart w:id="103" w:name="ref-wilkinson_fair_2016"/>
+    <w:bookmarkEnd w:id="104"/>
+    <w:bookmarkStart w:id="106" w:name="ref-wilkinson_fair_2016"/>
     <w:p>
       <w:pPr>
         <w:pStyle w:val="Bibliography"/>
@@ -9848,7 +10018,7 @@
       <w:r>
         <w:t xml:space="preserve"> </w:t>
       </w:r>
-      <w:hyperlink r:id="rId102">
+      <w:hyperlink r:id="rId105">
         <w:r>
           <w:rPr>
             <w:rStyle w:val="Hyperlink"/>
@@ -9860,8 +10030,8 @@
         <w:t xml:space="preserve">.</w:t>
       </w:r>
     </w:p>
-    <w:bookmarkEnd w:id="103"/>
-    <w:bookmarkStart w:id="105" w:name="ref-wright_open_2023"/>
+    <w:bookmarkEnd w:id="106"/>
+    <w:bookmarkStart w:id="108" w:name="ref-wright_open_2023"/>
     <w:p>
       <w:pPr>
         <w:pStyle w:val="Bibliography"/>
@@ -9897,7 +10067,7 @@
       <w:r>
         <w:t xml:space="preserve"> </w:t>
       </w:r>
-      <w:hyperlink r:id="rId104">
+      <w:hyperlink r:id="rId107">
         <w:r>
           <w:rPr>
             <w:rStyle w:val="Hyperlink"/>
@@ -9909,8 +10079,8 @@
         <w:t xml:space="preserve">.</w:t>
       </w:r>
     </w:p>
-    <w:bookmarkEnd w:id="105"/>
-    <w:bookmarkStart w:id="107" w:name="ref-zenodo_policies_2024"/>
+    <w:bookmarkEnd w:id="108"/>
+    <w:bookmarkStart w:id="110" w:name="ref-zenodo_policies_2024"/>
     <w:p>
       <w:pPr>
         <w:pStyle w:val="Bibliography"/>
@@ -9934,7 +10104,7 @@
       <w:r>
         <w:t xml:space="preserve"> </w:t>
       </w:r>
-      <w:hyperlink r:id="rId106">
+      <w:hyperlink r:id="rId109">
         <w:r>
           <w:rPr>
             <w:rStyle w:val="Hyperlink"/>
@@ -9946,9 +10116,9 @@
         <w:t xml:space="preserve">; CERN / OpenAIRE.</w:t>
       </w:r>
     </w:p>
-    <w:bookmarkEnd w:id="107"/>
-    <w:bookmarkEnd w:id="108"/>
-    <w:bookmarkEnd w:id="109"/>
+    <w:bookmarkEnd w:id="110"/>
+    <w:bookmarkEnd w:id="111"/>
+    <w:bookmarkEnd w:id="112"/>
     <w:sectPr>
       <w:footnotePr>
         <w:numRestart w:val="eachSect"/>

</xml_diff>